<commit_message>
Enable production laboratory workflow and update guide
</commit_message>
<xml_diff>
--- a/docs/Hayked_Laboratory_User_Guide.docx
+++ b/docs/Hayked_Laboratory_User_Guide.docx
@@ -26,7 +26,7 @@
         <w:t xml:space="preserve">Current availability.  </w:t>
       </w:r>
       <w:r>
-        <w:t>The working database runs on the local computer. The online link shows an interface preview only and cannot save samples or create reports.</w:t>
+        <w:t>The online site saves laboratory records in Hayked's production database and generates printable approved PDFs. The local version uses a separate local database for testing.</w:t>
       </w:r>
     </w:p>
     <w:p>
@@ -61,17 +61,17 @@
         <w:rPr>
           <w:b/>
         </w:rPr>
-        <w:t xml:space="preserve">Online preview.  </w:t>
+        <w:t xml:space="preserve">Online production.  </w:t>
       </w:r>
       <w:r>
-        <w:t xml:space="preserve">Use this to view the design. Saving and printing are unavailable. </w:t>
+        <w:t xml:space="preserve">Use this for real laboratory work from an authorized staff account. Save, review, approve, and print reports online. </w:t>
       </w:r>
       <w:hyperlink r:id="rId12">
         <w:r>
           <w:rPr>
             <w:color w:val="346A84"/>
           </w:rPr>
-          <w:t>Open interface preview</w:t>
+          <w:t>Open live Laboratory</w:t>
         </w:r>
       </w:hyperlink>
     </w:p>
@@ -109,7 +109,7 @@
         <w:t xml:space="preserve">1.  Open Laboratory.  </w:t>
       </w:r>
       <w:r>
-        <w:t>Sign in to the working local app and select Laboratory. The page should show records, not the interface preview message.</w:t>
+        <w:t>Sign in to the online site or the working local app and select Laboratory. The page should show your sample list and a registration form.</w:t>
       </w:r>
     </w:p>
     <w:p>

</xml_diff>